<commit_message>
compare108: report genes missing from the ORP count as masking by --top 0.1
The merge trace shows 78% of genes found among component hits but not ORP's
sit inside an ORP contig whose stronger hit to a related protein hides them;
at most 12% (median 77 per run) have no match in ORP. Section 4.3, the Table 2
caption, Methods and the polyploid paragraph now say so; S1 gains sheet
Gene_masking, built by explain_gene_masking.py.

Co-Authored-By: Claude Opus 5.5 <noreply@anthropic.com>
</commit_message>
<xml_diff>
--- a/experiments/compare108/handoff/paper_20261023/ORP_4.0.0_application_note_draft.docx
+++ b/experiments/compare108/handoff/paper_20261023/ORP_4.0.0_application_note_draft.docx
@@ -574,6 +574,20 @@
       </w:pPr>
       <w:r>
         <w:rPr>
+          <w:b/>
+        </w:rPr>
+        <w:t>Genes missing from the ORP count.</w:t>
+      </w:r>
+      <w:r>
+        <w:t xml:space="preserve"> To see why a component can report genes that ORP does not, we reran DIAMOND on all five assemblies of each run with ORP's settings and listed every Swiss-Prot gene among the hits of at least one component but none of the ORP contigs. For each gene, one component contig whose hits included it was located in the ORP assembly with blastn (best match, with its identity and the fraction of the component contig it covered). A gene was classed as masked when that contig matched an ORP contig at ≥95% identity over ≥90% of its length and the gene's bitscore was below 90% of the ORP contig's best bitscore, the cutoff that --top 0.1 applies. Per-run counts are in Supplementary Data S1 (sheet Gene_masking).</w:t>
+      </w:r>
+    </w:p>
+    <w:p>
+      <w:pPr>
+        <w:pStyle w:val="BodyText"/>
+      </w:pPr>
+      <w:r>
+        <w:rPr>
           <w:bCs/>
           <w:b/>
         </w:rPr>
@@ -1041,6 +1055,32 @@
       </w:r>
       <w:r>
         <w:t xml:space="preserve">(77 more).</w:t>
+      </w:r>
+    </w:p>
+    <w:p>
+      <w:pPr>
+        <w:pStyle w:val="BodyText"/>
+      </w:pPr>
+      <w:r>
+        <w:t xml:space="preserve">The gene count understates what the merge keeps. Every dataset had genes found among the hits of some component but not of ORP, a median of 798 per run (range 155–1,821), but for most of them the sequence was still in the ORP assembly. In 78% of cases the component contig lay within an ORP contig whose best hit was a different protein, often a related one (for example, one 14-3-3 protein within a contig whose best hit was another), and scored more than 10% higher than the hit to the missing gene. DIAMOND's --top 0.1 then reports only the stronger hit, so the gene drops out of the count. ORP's selection keeps at least one contig for every gene, so these contigs were removed afterwards, at the final CD-HIT-EST step (98% identity), which clusters contigs regardless of their gene. A further 4% lay within an ORP contig with no hit at all, because the hit was marginal (bitscores of about 55–60) and no longer passed the E-value cutoff on the longer query, and 7% lay within an ORP contig whose reported hits omitted the gene for reasons the hit tables did not resolve. Only 12% (median 77 per run, range 9–303) had no match in the ORP assembly at ≥95% identity over ≥90% of their length. That is an upper bound on gene sequence lost in the merge, since one contig was tested per gene and another copy may have been kept. The two datasets in which Trans-ABySS recovered more genes follow the same pattern: 1,094 of the 1,329 genes missing from the ORP count in </w:t>
+      </w:r>
+      <w:r>
+        <w:rPr>
+          <w:i/>
+        </w:rPr>
+        <w:t>P. miniata</w:t>
+      </w:r>
+      <w:r>
+        <w:t xml:space="preserve"> were masked and 91 had no match, and in </w:t>
+      </w:r>
+      <w:r>
+        <w:rPr>
+          <w:i/>
+        </w:rPr>
+        <w:t>A. gambiae</w:t>
+      </w:r>
+      <w:r>
+        <w:t xml:space="preserve"> 963 of 1,136 were masked and 88 had no match. Unique genes therefore count Swiss-Prot names rather than sequence, and the count is conservative for a merged assembly whose contigs are longer than those of its inputs.</w:t>
       </w:r>
     </w:p>
     <w:p>
@@ -2750,16 +2790,12 @@
       </w:pPr>
       <w:r>
         <w:rPr>
-          <w:bCs/>
           <w:b/>
         </w:rPr>
-        <w:t xml:space="preserve">Table 2.</w:t>
-      </w:r>
-      <w:r>
-        <w:t xml:space="preserve"> </w:t>
-      </w:r>
-      <w:r>
-        <w:t xml:space="preserve">ORP 4.0.0 compared with each of the four assemblies it merges, across all 59 datasets. Each cell gives the number of datasets in which the ORP assembly is better and, in parentheses, the median difference, ORP minus the assembler (percentage points for percentages; lower is better for BUSCO duplicated). Best single, the best of the four assemblers in each dataset, chosen separately for each metric. All assemblies of a dataset were scored with BUSCO v6.1.0 against the same lineage dataset and with pyTransRate 2.2.2 against the same trimmed, error-corrected reads. Against every assembler, differences in BUSCO completeness and unique genes had q &lt; 0.001 and differences in BUSCO duplication q &lt; 0.005 (Wilcoxon signed-rank, Benjamini-Hochberg within assembler). Full statistics, per-run component values and the best single assembler for each metric are in Supplementary Data S1 (sheets ORP_vs_assembler, Components and ORP_vs_best_single).</w:t>
+        <w:t>Table 2.</w:t>
+      </w:r>
+      <w:r>
+        <w:t xml:space="preserve"> ORP 4.0.0 compared with each of the four assemblies it merges, across all 59 datasets. Each cell gives the number of datasets in which the ORP assembly is better and, in parentheses, the median difference, ORP minus the assembler (percentage points for percentages; lower is better for BUSCO duplicated). Best single, the best of the four assemblers in each dataset, chosen separately for each metric. All assemblies of a dataset were scored with BUSCO v6.1.0 against the same lineage dataset and with pyTransRate 2.2.2 against the same trimmed, error-corrected reads. Against every assembler, differences in BUSCO completeness and unique genes had q &lt; 0.001 and differences in BUSCO duplication q &lt; 0.005 (Wilcoxon signed-rank, Benjamini-Hochberg within assembler). Unique Swiss-Prot genes counts distinct gene names among DIAMOND hits within 10% of each contig's best (--top 0.1), so a gene whose sequence the merge keeps inside a longer contig with a stronger hit to a related protein is not counted; the row is conservative for ORP (Section 4.3; Supplementary Data S1, sheet Gene_masking). Full statistics, per-run component values and the best single assembler for each metric are in Supplementary Data S1 (sheets ORP_vs_assembler, Components and ORP_vs_best_single).</w:t>
       </w:r>
     </w:p>
     <w:tbl>
@@ -3419,129 +3455,106 @@
         <w:pStyle w:val="BodyText"/>
       </w:pPr>
       <w:r>
-        <w:t xml:space="preserve">Polyploid genomes are the clearest limitation of the merge. In all 14 land plants, ORP 4.0.0 recovered more distinct genes than any of its four component assemblies, and it was the most complete assembly in 12 and within 0.2 points of the most complete in the other two. Read support, however, fell behind the best component in the allopolyploids: concordant mapping to the ORP assembly trailed the best single assembler by 15.5 points in the allohexaploid</w:t>
-      </w:r>
-      <w:r>
-        <w:t xml:space="preserve"> </w:t>
-      </w:r>
-      <w:r>
-        <w:rPr>
-          <w:iCs/>
-          <w:i/>
-        </w:rPr>
-        <w:t xml:space="preserve">Avena sativa</w:t>
-      </w:r>
-      <w:r>
-        <w:t xml:space="preserve"> </w:t>
-      </w:r>
-      <w:r>
-        <w:t xml:space="preserve">(79.2% vs 94.7% for rnaSPAdes high-k), by 8.7 in the allotetraploid</w:t>
-      </w:r>
-      <w:r>
-        <w:t xml:space="preserve"> </w:t>
-      </w:r>
-      <w:r>
-        <w:rPr>
-          <w:iCs/>
-          <w:i/>
-        </w:rPr>
-        <w:t xml:space="preserve">Brassica juncea</w:t>
-      </w:r>
-      <w:r>
-        <w:t xml:space="preserve">, and by about 5 in</w:t>
-      </w:r>
-      <w:r>
-        <w:t xml:space="preserve"> </w:t>
-      </w:r>
-      <w:r>
-        <w:rPr>
-          <w:iCs/>
-          <w:i/>
-        </w:rPr>
-        <w:t xml:space="preserve">Nicotiana tabacum</w:t>
-      </w:r>
-      <w:r>
-        <w:t xml:space="preserve"> </w:t>
-      </w:r>
-      <w:r>
-        <w:t xml:space="preserve">and the triploid</w:t>
-      </w:r>
-      <w:r>
-        <w:t xml:space="preserve"> </w:t>
-      </w:r>
-      <w:r>
-        <w:rPr>
-          <w:iCs/>
-          <w:i/>
-        </w:rPr>
-        <w:t xml:space="preserve">Musa</w:t>
-      </w:r>
-      <w:r>
-        <w:t xml:space="preserve"> </w:t>
-      </w:r>
-      <w:r>
-        <w:t xml:space="preserve">ABB [VERIFY ploidy], against a median of 0.8 points outside plants. Duplication shows the same pattern from the other side. The</w:t>
-      </w:r>
-      <w:r>
-        <w:t xml:space="preserve"> </w:t>
-      </w:r>
-      <w:r>
-        <w:rPr>
-          <w:iCs/>
-          <w:i/>
-        </w:rPr>
-        <w:t xml:space="preserve">B. juncea</w:t>
-      </w:r>
-      <w:r>
-        <w:t xml:space="preserve"> </w:t>
-      </w:r>
-      <w:r>
-        <w:t xml:space="preserve">and</w:t>
-      </w:r>
-      <w:r>
-        <w:t xml:space="preserve"> </w:t>
-      </w:r>
-      <w:r>
-        <w:rPr>
-          <w:iCs/>
-          <w:i/>
-        </w:rPr>
-        <w:t xml:space="preserve">N. tabacum</w:t>
-      </w:r>
-      <w:r>
-        <w:t xml:space="preserve"> </w:t>
-      </w:r>
-      <w:r>
-        <w:t xml:space="preserve">assemblies were 60.9% and 30.0% duplicated, far below Trinity (90.6% and 88.2%) and rnaSPAdes (72–84%) but well above Trans-ABySS (3.7% and 5.6%), whose low duplication came with the weakest read support of the four assemblers (60.4% good mappings in</w:t>
-      </w:r>
-      <w:r>
-        <w:t xml:space="preserve"> </w:t>
-      </w:r>
-      <w:r>
-        <w:rPr>
-          <w:iCs/>
-          <w:i/>
-        </w:rPr>
-        <w:t xml:space="preserve">B. juncea</w:t>
-      </w:r>
-      <w:r>
-        <w:t xml:space="preserve">), suggesting it collapses homeologs rather than resolving them. We attribute ORP’s behavior to how the merge keeps copies of a gene: beyond one representative it rescues at most two further contigs per Swiss-Prot gene, and only those the representative covers over less than half their length at ≥95% identity. Homeologs diverged beyond that threshold are kept and counted by BUSCO as duplicates, while a gene with more homeologs and isoforms than the cap allows loses some, and reads from the lost copies no longer map as concordant pairs. In allopolyploids BUSCO duplication is also a weak guide to redundancy, since two or three expressed copies of a single-copy ortholog are expected. Ploidy does not explain everything: the diploid</w:t>
-      </w:r>
-      <w:r>
-        <w:t xml:space="preserve"> </w:t>
-      </w:r>
-      <w:r>
-        <w:rPr>
-          <w:iCs/>
-          <w:i/>
-        </w:rPr>
-        <w:t xml:space="preserve">Thlaspi arvense</w:t>
-      </w:r>
-      <w:r>
-        <w:t xml:space="preserve"> </w:t>
-      </w:r>
-      <w:r>
-        <w:t xml:space="preserve">was 24.4% duplicated, against 56–73% for Trinity and rnaSPAdes [VERIFY: ploidy; heterozygosity or retained paralogs?]. Users assembling polyploid transcriptomes should expect more duplication and less read support than for diploids, and should judge assemblies by read mapping as well as BUSCO.</w:t>
+        <w:t xml:space="preserve">Polyploid genomes are the clearest limitation of the merge. In all 14 land plants, ORP 4.0.0 recovered more distinct genes than any of its four component assemblies, and it was the most complete assembly in 12 and within 0.2 points of the most complete in the other two. Read support, however, fell behind the best component in the allopolyploids: concordant mapping to the ORP assembly trailed the best single assembler by 15.5 points in the allohexaploid </w:t>
+      </w:r>
+      <w:r>
+        <w:rPr>
+          <w:i/>
+        </w:rPr>
+        <w:t>Avena sativa</w:t>
+      </w:r>
+      <w:r>
+        <w:t xml:space="preserve"> (79.2% vs 94.7% for rnaSPAdes high-k), by 8.7 in the allotetraploid </w:t>
+      </w:r>
+      <w:r>
+        <w:rPr>
+          <w:i/>
+        </w:rPr>
+        <w:t>Brassica juncea</w:t>
+      </w:r>
+      <w:r>
+        <w:t xml:space="preserve">, and by about 5 in </w:t>
+      </w:r>
+      <w:r>
+        <w:rPr>
+          <w:i/>
+        </w:rPr>
+        <w:t>Nicotiana tabacum</w:t>
+      </w:r>
+      <w:r>
+        <w:t xml:space="preserve"> and the triploid </w:t>
+      </w:r>
+      <w:r>
+        <w:rPr>
+          <w:i/>
+        </w:rPr>
+        <w:t>Musa</w:t>
+      </w:r>
+      <w:r>
+        <w:t xml:space="preserve"> ABB [VERIFY ploidy], against a median of 0.8 points outside plants. Duplication shows the same pattern from the other side. The </w:t>
+      </w:r>
+      <w:r>
+        <w:rPr>
+          <w:i/>
+        </w:rPr>
+        <w:t>B. juncea</w:t>
+      </w:r>
+      <w:r>
+        <w:t xml:space="preserve"> and </w:t>
+      </w:r>
+      <w:r>
+        <w:rPr>
+          <w:i/>
+        </w:rPr>
+        <w:t>N. tabacum</w:t>
+      </w:r>
+      <w:r>
+        <w:t xml:space="preserve"> assemblies were 60.9% and 30.0% duplicated, far below Trinity (90.6% and 88.2%) and rnaSPAdes (72–84%) but well above Trans-ABySS (3.7% and 5.6%), whose low duplication came with the weakest read support of the four assemblers (60.4% good mappings in </w:t>
+      </w:r>
+      <w:r>
+        <w:rPr>
+          <w:i/>
+        </w:rPr>
+        <w:t>B. juncea</w:t>
+      </w:r>
+      <w:r>
+        <w:t xml:space="preserve">), suggesting it collapses homeologs rather than resolving them. We attribute ORP's behavior to the two places where the merge removes copies of a gene. Within a Swiss-Prot gene, beyond one representative it rescues at most two further contigs, and only those the representative covers over less than half their length at ≥95% identity. Homeologs diverged beyond that threshold are kept and counted by BUSCO as duplicates, while a gene with more homeologs and isoforms than the cap allows loses some. After that selection, CD-HIT-EST removes any contig that is at least 98% identical to part of a longer one, whatever gene either contig hits. Reads from the removed copies no longer map as concordant pairs. Land plants lost the most sequence this way: genes found in a component but with no match in the ORP assembly numbered a median of 149 per land-plant dataset, against 16 to 80 in the other groups, and </w:t>
+      </w:r>
+      <w:r>
+        <w:rPr>
+          <w:i/>
+        </w:rPr>
+        <w:t>A. sativa</w:t>
+      </w:r>
+      <w:r>
+        <w:t xml:space="preserve"> had the second highest count of all 59 datasets (267). Even there, most genes missing from the ORP count were masked rather than lost (936 of 1,340 in </w:t>
+      </w:r>
+      <w:r>
+        <w:rPr>
+          <w:i/>
+        </w:rPr>
+        <w:t>A. sativa</w:t>
+      </w:r>
+      <w:r>
+        <w:t xml:space="preserve">, 774 of 1,031 in </w:t>
+      </w:r>
+      <w:r>
+        <w:rPr>
+          <w:i/>
+        </w:rPr>
+        <w:t>N. tabacum</w:t>
+      </w:r>
+      <w:r>
+        <w:t xml:space="preserve">; Section 4.3), so the gene counts understate what the plant assemblies contain. In allopolyploids BUSCO duplication is also a weak guide to redundancy, since two or three expressed copies of a single-copy ortholog are expected. Ploidy does not explain everything: the diploid </w:t>
+      </w:r>
+      <w:r>
+        <w:rPr>
+          <w:i/>
+        </w:rPr>
+        <w:t>Thlaspi arvense</w:t>
+      </w:r>
+      <w:r>
+        <w:t xml:space="preserve"> was 24.4% duplicated, against 56–73% for Trinity and rnaSPAdes [VERIFY: ploidy; heterozygosity or retained paralogs?]. Users assembling polyploid transcriptomes should expect more duplication and less read support than for diploids, and should judge assemblies by read mapping as well as BUSCO.</w:t>
       </w:r>
     </w:p>
     <w:p>

</xml_diff>

<commit_message>
compare108: Section 4.4 and S1 settings sheet on all 59 datasets
settings_compare.py keeps runs whose only notes concern the original
assembly (GAGA, GAGB, GAWB were dropped); collect_lineage410.py gains
--slurm-array because duplicate 1325631 rewrote the dev30set task logs.

Co-Authored-By: Claude Opus 5.5 <noreply@anthropic.com>
</commit_message>
<xml_diff>
--- a/experiments/compare108/handoff/paper_20261023/ORP_4.0.0_application_note_draft.docx
+++ b/experiments/compare108/handoff/paper_20261023/ORP_4.0.0_application_note_draft.docx
@@ -1114,7 +1114,7 @@
         <w:pStyle w:val="FirstParagraph"/>
       </w:pPr>
       <w:r>
-        <w:t xml:space="preserve">An earlier run of the first 50 datasets with a development build (dev30) differed from the final runs in two settings only: Trinity normalized the reads, and contigs without a Swiss-Prot hit were filtered at a fixed coverage of 2 instead of the depth-scaled threshold. Assembly quality barely changed. BUSCO completeness differed by at most 0.4 points in any dataset (median difference 0.0), distinct genes by −24 to +72, and the pyTransRate score by −0.036 to +0.008 (median −0.005; lower in 41 of 50).</w:t>
+        <w:t>Every dataset was also assembled a second time with two settings changed: Trinity normalized the reads, and contigs without a Swiss-Prot hit were filtered at a fixed coverage of 2 instead of the depth-scaled threshold. For the first 50 datasets this second run came from an earlier development build (dev30) that differed from the release in these two settings only; for the nine ORP 2018 libraries added last, it was ORP 4.0.0 itself with the two settings changed. Assembly quality barely changed. BUSCO completeness differed by at most 0.4 points in any dataset (median difference 0.0), distinct genes by −43 to +72, and the pyTransRate score by −0.036 to +0.008 (median −0.004; lower in 46 of 59).</w:t>
       </w:r>
     </w:p>
     <w:p>
@@ -1122,39 +1122,43 @@
         <w:pStyle w:val="BodyText"/>
       </w:pPr>
       <w:r>
-        <w:t xml:space="preserve">The filter moved contig counts the way the depth scaling predicts. On the 41 of those libraries below 60 million read pairs, the depth-scaled threshold was below 2 and kept 1–23% more contigs (median 3.4%). On the nine deeper libraries it was 2.1 to 5.6 and removed 1–35% of contigs, most in</w:t>
-      </w:r>
-      <w:r>
-        <w:t xml:space="preserve"> </w:t>
-      </w:r>
-      <w:r>
-        <w:rPr>
-          <w:iCs/>
-          <w:i/>
-        </w:rPr>
-        <w:t xml:space="preserve">Mus musculus</w:t>
-      </w:r>
-      <w:r>
-        <w:t xml:space="preserve"> </w:t>
-      </w:r>
-      <w:r>
-        <w:t xml:space="preserve">(292,000 to 190,000) and</w:t>
-      </w:r>
-      <w:r>
-        <w:t xml:space="preserve"> </w:t>
-      </w:r>
-      <w:r>
-        <w:rPr>
-          <w:iCs/>
-          <w:i/>
-        </w:rPr>
-        <w:t xml:space="preserve">Anopheles gambiae</w:t>
-      </w:r>
-      <w:r>
-        <w:t xml:space="preserve"> </w:t>
-      </w:r>
-      <w:r>
-        <w:t xml:space="preserve">(76,000 to 51,000), with BUSCO completeness within 0.2 points. Turning normalization off cost time without a measurable gain in quality: Trinity took 18% longer in total (291 to 343 hours) and whole runs 8% longer (409 to 442 hours; longer in 39 of 50 datasets). Per-dataset values are in Supplementary Data S1 (sheet Settings_dev30_vs_400).</w:t>
+        <w:t xml:space="preserve">The filter moved contig counts the way the depth scaling predicts. In the 44 libraries where the depth-scaled threshold was below 2, it kept 1–23% more contigs (median 3.6%). In the 15 where it was 2.1 to 5.6, it removed 1–35% of contigs in all but </w:t>
+      </w:r>
+      <w:r>
+        <w:rPr>
+          <w:i/>
+        </w:rPr>
+        <w:t>Entamoeba histolytica</w:t>
+      </w:r>
+      <w:r>
+        <w:t xml:space="preserve"> (0.5% more), most in </w:t>
+      </w:r>
+      <w:r>
+        <w:rPr>
+          <w:i/>
+        </w:rPr>
+        <w:t>Mus musculus</w:t>
+      </w:r>
+      <w:r>
+        <w:t xml:space="preserve"> (292,000 to 190,000), </w:t>
+      </w:r>
+      <w:r>
+        <w:rPr>
+          <w:i/>
+        </w:rPr>
+        <w:t>Anopheles gambiae</w:t>
+      </w:r>
+      <w:r>
+        <w:t xml:space="preserve"> (76,000 to 51,000) and </w:t>
+      </w:r>
+      <w:r>
+        <w:rPr>
+          <w:i/>
+        </w:rPr>
+        <w:t>Thlaspi arvense</w:t>
+      </w:r>
+      <w:r>
+        <w:t xml:space="preserve"> (82,000 to 62,000), with BUSCO completeness within 0.4 points. Turning normalization off cost time without a measurable gain in quality: Trinity took 21% longer in total (347 to 419 hours), whole runs 9% longer (498 to 540 hours; longer in 48 of 59 datasets), and CPU time rose 15% (9,891 to 11,418 CPU-hours). Per-dataset values, with the source of each second run, are in Supplementary Data S1 (sheet Settings_dev30_vs_400).</w:t>
       </w:r>
     </w:p>
     <w:bookmarkEnd w:id="27"/>
@@ -3593,16 +3597,12 @@
       </w:pPr>
       <w:r>
         <w:rPr>
-          <w:iCs/>
-          <w:i/>
-        </w:rPr>
-        <w:t xml:space="preserve">Supplementary Data S1</w:t>
-      </w:r>
-      <w:r>
-        <w:t xml:space="preserve"> </w:t>
-      </w:r>
-      <w:r>
-        <w:t xml:space="preserve">(ORP_4.0.0_lineage_results.xlsx). All results reported in the paper, as values. Sheets: README (methods, versions and sheet guide); Summary (headline numbers); Table1a and Table1b (Table 1, with Wilcoxon P and Benjamini-Hochberg q); Datasets (each of the 59 datasets: accessions, BUSCO lineage, ORP build, read pairs, coverage threshold, and previous and ORP 4.0.0 values with their difference for every metric); Groups (medians by taxonomic group); ORP_vs_assembler (Table 2: ORP 4.0.0 against each component assembler, with medians, counts, P and q); ORP_vs_best_single (Table 2, best single assembler); Components (ORP 4.0.0 and its four component assemblies, per run); Settings_dev30_vs_400 (Section 4.4, first 50 datasets); RunTime (wall time and peak memory for each run; CPU-hours and per-step hours for the first 50).</w:t>
+          <w:i/>
+        </w:rPr>
+        <w:t>Supplementary Data S1</w:t>
+      </w:r>
+      <w:r>
+        <w:t xml:space="preserve"> (ORP_4.0.0_lineage_results.xlsx). All results reported in the paper, as values. Sheets: README (methods, versions and sheet guide); Summary (headline numbers); Table1a and Table1b (Table 1, with Wilcoxon P and Benjamini-Hochberg q); Datasets (each of the 59 datasets: accessions, BUSCO lineage, ORP build, read pairs, coverage threshold, and previous and ORP 4.0.0 values with their difference for every metric); Groups (medians by taxonomic group); ORP_vs_assembler (Table 2: ORP 4.0.0 against each component assembler, with medians, counts, P and q); ORP_vs_best_single (Table 2, best single assembler); Components (ORP 4.0.0 and its four component assemblies, per run); Settings_dev30_vs_400 (Section 4.4: each dataset assembled with read normalization on and a fixed coverage threshold of 2, against ORP 4.0.0); RunTime (wall time and peak memory for each run; CPU-hours and per-step hours for the first 50).</w:t>
       </w:r>
     </w:p>
     <w:p>

</xml_diff>